<commit_message>
changing transaction form and app.js to match week 6
might have messed up on the data dictionary, i will fix it probably in the next commit.
</commit_message>
<xml_diff>
--- a/docs/Milestone 2(3) System Design/MIS3371-Data-Dictionary.docx
+++ b/docs/Milestone 2(3) System Design/MIS3371-Data-Dictionary.docx
@@ -903,10 +903,7 @@
               <w:spacing w:after="160" w:line="278" w:lineRule="auto"/>
             </w:pPr>
             <w:r>
-              <w:t>Required if more than</w:t>
-            </w:r>
-            <w:r>
-              <w:t xml:space="preserve"> $15</w:t>
+              <w:t>If checkbox is checked</w:t>
             </w:r>
           </w:p>
         </w:tc>
@@ -940,7 +937,7 @@
             </w:pPr>
             <w:proofErr w:type="spellStart"/>
             <w:r>
-              <w:t>receiptRequired</w:t>
+              <w:t>pointsRequired</w:t>
             </w:r>
             <w:proofErr w:type="spellEnd"/>
           </w:p>
@@ -955,7 +952,11 @@
               <w:spacing w:after="160" w:line="278" w:lineRule="auto"/>
             </w:pPr>
             <w:r>
-              <w:t>If a receipt is policy required</w:t>
+              <w:t xml:space="preserve">Points needed to </w:t>
+            </w:r>
+            <w:r>
+              <w:lastRenderedPageBreak/>
+              <w:t>earn the reward</w:t>
             </w:r>
           </w:p>
         </w:tc>
@@ -968,115 +969,8 @@
             <w:pPr>
               <w:spacing w:after="160" w:line="278" w:lineRule="auto"/>
             </w:pPr>
-            <w:proofErr w:type="spellStart"/>
-            <w:r>
-              <w:t>boolean</w:t>
-            </w:r>
-            <w:proofErr w:type="spellEnd"/>
-          </w:p>
-        </w:tc>
-        <w:tc>
-          <w:tcPr>
-            <w:tcW w:w="1440" w:type="dxa"/>
-            <w:vAlign w:val="center"/>
-          </w:tcPr>
-          <w:p>
-            <w:pPr>
-              <w:spacing w:after="160" w:line="278" w:lineRule="auto"/>
-            </w:pPr>
-            <w:r>
-              <w:t>System</w:t>
-            </w:r>
-          </w:p>
-        </w:tc>
-        <w:tc>
-          <w:tcPr>
-            <w:tcW w:w="1298" w:type="dxa"/>
-            <w:vAlign w:val="center"/>
-          </w:tcPr>
-          <w:p>
-            <w:pPr>
-              <w:spacing w:after="160" w:line="278" w:lineRule="auto"/>
-            </w:pPr>
-            <w:r>
-              <w:t>Derived</w:t>
-            </w:r>
-          </w:p>
-        </w:tc>
-        <w:tc>
-          <w:tcPr>
-            <w:tcW w:w="1672" w:type="dxa"/>
-            <w:vAlign w:val="center"/>
-          </w:tcPr>
-          <w:p>
-            <w:pPr>
-              <w:spacing w:after="160" w:line="278" w:lineRule="auto"/>
-            </w:pPr>
-            <w:r>
-              <w:t>Amount more than 15</w:t>
-            </w:r>
-          </w:p>
-        </w:tc>
-        <w:tc>
-          <w:tcPr>
-            <w:tcW w:w="1445" w:type="dxa"/>
-            <w:vAlign w:val="center"/>
-          </w:tcPr>
-          <w:p>
-            <w:pPr>
-              <w:spacing w:after="160" w:line="278" w:lineRule="auto"/>
-            </w:pPr>
-            <w:r>
-              <w:t>false</w:t>
-            </w:r>
-          </w:p>
-        </w:tc>
-      </w:tr>
-      <w:tr>
-        <w:trPr>
-          <w:jc w:val="center"/>
-        </w:trPr>
-        <w:tc>
-          <w:tcPr>
-            <w:tcW w:w="1890" w:type="dxa"/>
-            <w:vAlign w:val="center"/>
-          </w:tcPr>
-          <w:p>
-            <w:pPr>
-              <w:spacing w:after="160" w:line="278" w:lineRule="auto"/>
-            </w:pPr>
-            <w:proofErr w:type="spellStart"/>
             <w:r>
               <w:lastRenderedPageBreak/>
-              <w:t>pointsRequired</w:t>
-            </w:r>
-            <w:proofErr w:type="spellEnd"/>
-          </w:p>
-        </w:tc>
-        <w:tc>
-          <w:tcPr>
-            <w:tcW w:w="1345" w:type="dxa"/>
-            <w:vAlign w:val="center"/>
-          </w:tcPr>
-          <w:p>
-            <w:pPr>
-              <w:spacing w:after="160" w:line="278" w:lineRule="auto"/>
-            </w:pPr>
-            <w:r>
-              <w:t>Points needed to earn the reward</w:t>
-            </w:r>
-          </w:p>
-        </w:tc>
-        <w:tc>
-          <w:tcPr>
-            <w:tcW w:w="1080" w:type="dxa"/>
-            <w:vAlign w:val="center"/>
-          </w:tcPr>
-          <w:p>
-            <w:pPr>
-              <w:spacing w:after="160" w:line="278" w:lineRule="auto"/>
-            </w:pPr>
-            <w:r>
               <w:t>integer</w:t>
             </w:r>
           </w:p>
@@ -1912,6 +1806,7 @@
   <w:style w:type="character" w:default="1" w:styleId="DefaultParagraphFont">
     <w:name w:val="Default Paragraph Font"/>
     <w:uiPriority w:val="1"/>
+    <w:semiHidden/>
     <w:unhideWhenUsed/>
   </w:style>
   <w:style w:type="table" w:default="1" w:styleId="TableNormal">
@@ -2587,6 +2482,27 @@
 </file>
 
 <file path=customXml/item1.xml><?xml version="1.0" encoding="utf-8"?>
+<b:Sources xmlns:b="http://schemas.openxmlformats.org/officeDocument/2006/bibliography" xmlns="http://schemas.openxmlformats.org/officeDocument/2006/bibliography" SelectedStyle="\APASixthEditionOfficeOnline.xsl" StyleName="APA" Version="6"/>
+</file>
+
+<file path=customXml/item2.xml><?xml version="1.0" encoding="utf-8"?>
+<p:properties xmlns:p="http://schemas.microsoft.com/office/2006/metadata/properties" xmlns:xsi="http://www.w3.org/2001/XMLSchema-instance" xmlns:pc="http://schemas.microsoft.com/office/infopath/2007/PartnerControls">
+  <documentManagement>
+    <_activity xmlns="68107622-43a1-49c8-a214-d129ef5e3b8c" xsi:nil="true"/>
+  </documentManagement>
+</p:properties>
+</file>
+
+<file path=customXml/item3.xml><?xml version="1.0" encoding="utf-8"?>
+<?mso-contentType ?>
+<FormTemplates xmlns="http://schemas.microsoft.com/sharepoint/v3/contenttype/forms">
+  <Display>DocumentLibraryForm</Display>
+  <Edit>DocumentLibraryForm</Edit>
+  <New>DocumentLibraryForm</New>
+</FormTemplates>
+</file>
+
+<file path=customXml/item4.xml><?xml version="1.0" encoding="utf-8"?>
 <ct:contentTypeSchema xmlns:ct="http://schemas.microsoft.com/office/2006/metadata/contentType" xmlns:ma="http://schemas.microsoft.com/office/2006/metadata/properties/metaAttributes" ct:_="" ma:_="" ma:contentTypeName="Document" ma:contentTypeID="0x010100112A4F20A68A3245B38AC9ED5E9EDED5" ma:contentTypeVersion="6" ma:contentTypeDescription="Create a new document." ma:contentTypeScope="" ma:versionID="bd3f642476fc6b4e2c845a5635fc7edb">
   <xsd:schema xmlns:xsd="http://www.w3.org/2001/XMLSchema" xmlns:xs="http://www.w3.org/2001/XMLSchema" xmlns:p="http://schemas.microsoft.com/office/2006/metadata/properties" xmlns:ns3="68107622-43a1-49c8-a214-d129ef5e3b8c" targetNamespace="http://schemas.microsoft.com/office/2006/metadata/properties" ma:root="true" ma:fieldsID="54157aad579c88213110e0868dfe51dd" ns3:_="">
     <xsd:import namespace="68107622-43a1-49c8-a214-d129ef5e3b8c"/>
@@ -2742,28 +2658,33 @@
 </ct:contentTypeSchema>
 </file>
 
-<file path=customXml/item2.xml><?xml version="1.0" encoding="utf-8"?>
-<?mso-contentType ?>
-<FormTemplates xmlns="http://schemas.microsoft.com/sharepoint/v3/contenttype/forms">
-  <Display>DocumentLibraryForm</Display>
-  <Edit>DocumentLibraryForm</Edit>
-  <New>DocumentLibraryForm</New>
-</FormTemplates>
+<file path=customXml/itemProps1.xml><?xml version="1.0" encoding="utf-8"?>
+<ds:datastoreItem xmlns:ds="http://schemas.openxmlformats.org/officeDocument/2006/customXml" ds:itemID="{E14976A9-7010-4417-A098-9E5B9DFFB115}">
+  <ds:schemaRefs>
+    <ds:schemaRef ds:uri="http://schemas.openxmlformats.org/officeDocument/2006/bibliography"/>
+  </ds:schemaRefs>
+</ds:datastoreItem>
 </file>
 
-<file path=customXml/item3.xml><?xml version="1.0" encoding="utf-8"?>
-<p:properties xmlns:p="http://schemas.microsoft.com/office/2006/metadata/properties" xmlns:xsi="http://www.w3.org/2001/XMLSchema-instance" xmlns:pc="http://schemas.microsoft.com/office/infopath/2007/PartnerControls">
-  <documentManagement>
-    <_activity xmlns="68107622-43a1-49c8-a214-d129ef5e3b8c" xsi:nil="true"/>
-  </documentManagement>
-</p:properties>
+<file path=customXml/itemProps2.xml><?xml version="1.0" encoding="utf-8"?>
+<ds:datastoreItem xmlns:ds="http://schemas.openxmlformats.org/officeDocument/2006/customXml" ds:itemID="{3836715A-C434-409A-98F3-F2E6E0EC68C1}">
+  <ds:schemaRefs>
+    <ds:schemaRef ds:uri="http://schemas.microsoft.com/office/2006/metadata/properties"/>
+    <ds:schemaRef ds:uri="http://schemas.microsoft.com/office/infopath/2007/PartnerControls"/>
+    <ds:schemaRef ds:uri="68107622-43a1-49c8-a214-d129ef5e3b8c"/>
+  </ds:schemaRefs>
+</ds:datastoreItem>
 </file>
 
-<file path=customXml/item4.xml><?xml version="1.0" encoding="utf-8"?>
-<b:Sources xmlns:b="http://schemas.openxmlformats.org/officeDocument/2006/bibliography" xmlns="http://schemas.openxmlformats.org/officeDocument/2006/bibliography" SelectedStyle="\APASixthEditionOfficeOnline.xsl" StyleName="APA" Version="6"/>
+<file path=customXml/itemProps3.xml><?xml version="1.0" encoding="utf-8"?>
+<ds:datastoreItem xmlns:ds="http://schemas.openxmlformats.org/officeDocument/2006/customXml" ds:itemID="{9A720D37-160F-4A3E-A9E9-3DB9D3A341AC}">
+  <ds:schemaRefs>
+    <ds:schemaRef ds:uri="http://schemas.microsoft.com/sharepoint/v3/contenttype/forms"/>
+  </ds:schemaRefs>
+</ds:datastoreItem>
 </file>
 
-<file path=customXml/itemProps1.xml><?xml version="1.0" encoding="utf-8"?>
+<file path=customXml/itemProps4.xml><?xml version="1.0" encoding="utf-8"?>
 <ds:datastoreItem xmlns:ds="http://schemas.openxmlformats.org/officeDocument/2006/customXml" ds:itemID="{6E4A4378-B1F7-481E-991E-874563831C52}">
   <ds:schemaRefs>
     <ds:schemaRef ds:uri="http://schemas.microsoft.com/office/2006/metadata/contentType"/>
@@ -2779,30 +2700,4 @@
     <ds:schemaRef ds:uri="http://schemas.microsoft.com/internal/obd"/>
   </ds:schemaRefs>
 </ds:datastoreItem>
-</file>
-
-<file path=customXml/itemProps2.xml><?xml version="1.0" encoding="utf-8"?>
-<ds:datastoreItem xmlns:ds="http://schemas.openxmlformats.org/officeDocument/2006/customXml" ds:itemID="{9A720D37-160F-4A3E-A9E9-3DB9D3A341AC}">
-  <ds:schemaRefs>
-    <ds:schemaRef ds:uri="http://schemas.microsoft.com/sharepoint/v3/contenttype/forms"/>
-  </ds:schemaRefs>
-</ds:datastoreItem>
-</file>
-
-<file path=customXml/itemProps3.xml><?xml version="1.0" encoding="utf-8"?>
-<ds:datastoreItem xmlns:ds="http://schemas.openxmlformats.org/officeDocument/2006/customXml" ds:itemID="{3836715A-C434-409A-98F3-F2E6E0EC68C1}">
-  <ds:schemaRefs>
-    <ds:schemaRef ds:uri="http://schemas.microsoft.com/office/2006/metadata/properties"/>
-    <ds:schemaRef ds:uri="http://schemas.microsoft.com/office/infopath/2007/PartnerControls"/>
-    <ds:schemaRef ds:uri="68107622-43a1-49c8-a214-d129ef5e3b8c"/>
-  </ds:schemaRefs>
-</ds:datastoreItem>
-</file>
-
-<file path=customXml/itemProps4.xml><?xml version="1.0" encoding="utf-8"?>
-<ds:datastoreItem xmlns:ds="http://schemas.openxmlformats.org/officeDocument/2006/customXml" ds:itemID="{E14976A9-7010-4417-A098-9E5B9DFFB115}">
-  <ds:schemaRefs>
-    <ds:schemaRef ds:uri="http://schemas.openxmlformats.org/officeDocument/2006/bibliography"/>
-  </ds:schemaRefs>
-</ds:datastoreItem>
 </file>
</xml_diff>

<commit_message>
Changed the code to make it more in line with the milestone
</commit_message>
<xml_diff>
--- a/docs/Milestone 2(3) System Design/MIS3371-Data-Dictionary.docx
+++ b/docs/Milestone 2(3) System Design/MIS3371-Data-Dictionary.docx
@@ -193,9 +193,11 @@
             <w:pPr>
               <w:spacing w:after="160" w:line="278" w:lineRule="auto"/>
             </w:pPr>
+            <w:proofErr w:type="spellStart"/>
             <w:r>
               <w:t>claimID</w:t>
             </w:r>
+            <w:proofErr w:type="spellEnd"/>
           </w:p>
         </w:tc>
         <w:tc>
@@ -296,9 +298,11 @@
             <w:pPr>
               <w:spacing w:after="160" w:line="278" w:lineRule="auto"/>
             </w:pPr>
+            <w:proofErr w:type="spellStart"/>
             <w:r>
               <w:t>customerID</w:t>
             </w:r>
+            <w:proofErr w:type="spellEnd"/>
           </w:p>
         </w:tc>
         <w:tc>
@@ -399,9 +403,11 @@
             <w:pPr>
               <w:spacing w:after="160" w:line="278" w:lineRule="auto"/>
             </w:pPr>
+            <w:proofErr w:type="spellStart"/>
             <w:r>
               <w:t>claimDate</w:t>
             </w:r>
+            <w:proofErr w:type="spellEnd"/>
           </w:p>
         </w:tc>
         <w:tc>
@@ -428,7 +434,7 @@
               <w:spacing w:after="160" w:line="278" w:lineRule="auto"/>
             </w:pPr>
             <w:r>
-              <w:t>date</w:t>
+              <w:t>timestamp</w:t>
             </w:r>
           </w:p>
         </w:tc>
@@ -531,7 +537,7 @@
               <w:spacing w:after="160" w:line="278" w:lineRule="auto"/>
             </w:pPr>
             <w:r>
-              <w:t>String/enum</w:t>
+              <w:t>String</w:t>
             </w:r>
           </w:p>
         </w:tc>
@@ -608,9 +614,11 @@
             <w:pPr>
               <w:spacing w:after="160" w:line="278" w:lineRule="auto"/>
             </w:pPr>
+            <w:proofErr w:type="spellStart"/>
             <w:r>
               <w:t>itemPrice</w:t>
             </w:r>
+            <w:proofErr w:type="spellEnd"/>
           </w:p>
         </w:tc>
         <w:tc>
@@ -820,9 +828,11 @@
             <w:pPr>
               <w:spacing w:after="160" w:line="278" w:lineRule="auto"/>
             </w:pPr>
+            <w:proofErr w:type="spellStart"/>
             <w:r>
               <w:t>receiptAttached</w:t>
             </w:r>
+            <w:proofErr w:type="spellEnd"/>
           </w:p>
         </w:tc>
         <w:tc>
@@ -848,9 +858,11 @@
             <w:pPr>
               <w:spacing w:after="160" w:line="278" w:lineRule="auto"/>
             </w:pPr>
+            <w:proofErr w:type="spellStart"/>
             <w:r>
               <w:t>boolean</w:t>
             </w:r>
+            <w:proofErr w:type="spellEnd"/>
           </w:p>
         </w:tc>
         <w:tc>
@@ -923,10 +935,12 @@
             <w:pPr>
               <w:spacing w:after="160" w:line="278" w:lineRule="auto"/>
             </w:pPr>
+            <w:proofErr w:type="spellStart"/>
             <w:r>
               <w:lastRenderedPageBreak/>
               <w:t>pointsRequired</w:t>
             </w:r>
+            <w:proofErr w:type="spellEnd"/>
           </w:p>
         </w:tc>
         <w:tc>
@@ -998,8 +1012,13 @@
               <w:spacing w:after="160" w:line="278" w:lineRule="auto"/>
             </w:pPr>
             <w:r>
-              <w:t>Calculated from itemPrice</w:t>
-            </w:r>
+              <w:t xml:space="preserve">Calculated from </w:t>
+            </w:r>
+            <w:proofErr w:type="spellStart"/>
+            <w:r>
+              <w:t>itemPrice</w:t>
+            </w:r>
+            <w:proofErr w:type="spellEnd"/>
           </w:p>
         </w:tc>
         <w:tc>
@@ -1028,9 +1047,11 @@
             <w:vAlign w:val="center"/>
           </w:tcPr>
           <w:p>
+            <w:proofErr w:type="spellStart"/>
             <w:r>
               <w:t>availablePoints</w:t>
             </w:r>
+            <w:proofErr w:type="spellEnd"/>
           </w:p>
         </w:tc>
         <w:tc>
@@ -1040,7 +1061,15 @@
           </w:tcPr>
           <w:p>
             <w:r>
-              <w:t>Points the customer currently has to spend</w:t>
+              <w:t xml:space="preserve">Points the customer currently </w:t>
+            </w:r>
+            <w:proofErr w:type="gramStart"/>
+            <w:r>
+              <w:t>has to</w:t>
+            </w:r>
+            <w:proofErr w:type="gramEnd"/>
+            <w:r>
+              <w:t xml:space="preserve"> spend</w:t>
             </w:r>
           </w:p>
         </w:tc>
@@ -1084,8 +1113,13 @@
           </w:tcPr>
           <w:p>
             <w:r>
-              <w:t>Pulled from the customer’s loyalty account using customerID</w:t>
-            </w:r>
+              <w:t xml:space="preserve">Pulled from the customer’s loyalty account using </w:t>
+            </w:r>
+            <w:proofErr w:type="spellStart"/>
+            <w:r>
+              <w:t>customerID</w:t>
+            </w:r>
+            <w:proofErr w:type="spellEnd"/>
           </w:p>
         </w:tc>
         <w:tc>
@@ -1142,8 +1176,13 @@
               <w:spacing w:after="160" w:line="278" w:lineRule="auto"/>
             </w:pPr>
             <w:r>
-              <w:t>String/enum</w:t>
-            </w:r>
+              <w:t>String/</w:t>
+            </w:r>
+            <w:proofErr w:type="spellStart"/>
+            <w:r>
+              <w:t>enum</w:t>
+            </w:r>
+            <w:proofErr w:type="spellEnd"/>
           </w:p>
         </w:tc>
         <w:tc>
@@ -2545,6 +2584,27 @@
 </file>
 
 <file path=customXml/item1.xml><?xml version="1.0" encoding="utf-8"?>
+<b:Sources xmlns:b="http://schemas.openxmlformats.org/officeDocument/2006/bibliography" xmlns="http://schemas.openxmlformats.org/officeDocument/2006/bibliography" SelectedStyle="\APASixthEditionOfficeOnline.xsl" StyleName="APA" Version="6"/>
+</file>
+
+<file path=customXml/item2.xml><?xml version="1.0" encoding="utf-8"?>
+<p:properties xmlns:p="http://schemas.microsoft.com/office/2006/metadata/properties" xmlns:xsi="http://www.w3.org/2001/XMLSchema-instance" xmlns:pc="http://schemas.microsoft.com/office/infopath/2007/PartnerControls">
+  <documentManagement>
+    <_activity xmlns="68107622-43a1-49c8-a214-d129ef5e3b8c" xsi:nil="true"/>
+  </documentManagement>
+</p:properties>
+</file>
+
+<file path=customXml/item3.xml><?xml version="1.0" encoding="utf-8"?>
+<?mso-contentType ?>
+<FormTemplates xmlns="http://schemas.microsoft.com/sharepoint/v3/contenttype/forms">
+  <Display>DocumentLibraryForm</Display>
+  <Edit>DocumentLibraryForm</Edit>
+  <New>DocumentLibraryForm</New>
+</FormTemplates>
+</file>
+
+<file path=customXml/item4.xml><?xml version="1.0" encoding="utf-8"?>
 <ct:contentTypeSchema xmlns:ct="http://schemas.microsoft.com/office/2006/metadata/contentType" xmlns:ma="http://schemas.microsoft.com/office/2006/metadata/properties/metaAttributes" ct:_="" ma:_="" ma:contentTypeName="Document" ma:contentTypeID="0x010100112A4F20A68A3245B38AC9ED5E9EDED5" ma:contentTypeVersion="6" ma:contentTypeDescription="Create a new document." ma:contentTypeScope="" ma:versionID="bd3f642476fc6b4e2c845a5635fc7edb">
   <xsd:schema xmlns:xsd="http://www.w3.org/2001/XMLSchema" xmlns:xs="http://www.w3.org/2001/XMLSchema" xmlns:p="http://schemas.microsoft.com/office/2006/metadata/properties" xmlns:ns3="68107622-43a1-49c8-a214-d129ef5e3b8c" targetNamespace="http://schemas.microsoft.com/office/2006/metadata/properties" ma:root="true" ma:fieldsID="54157aad579c88213110e0868dfe51dd" ns3:_="">
     <xsd:import namespace="68107622-43a1-49c8-a214-d129ef5e3b8c"/>
@@ -2700,28 +2760,33 @@
 </ct:contentTypeSchema>
 </file>
 
-<file path=customXml/item2.xml><?xml version="1.0" encoding="utf-8"?>
-<?mso-contentType ?>
-<FormTemplates xmlns="http://schemas.microsoft.com/sharepoint/v3/contenttype/forms">
-  <Display>DocumentLibraryForm</Display>
-  <Edit>DocumentLibraryForm</Edit>
-  <New>DocumentLibraryForm</New>
-</FormTemplates>
+<file path=customXml/itemProps1.xml><?xml version="1.0" encoding="utf-8"?>
+<ds:datastoreItem xmlns:ds="http://schemas.openxmlformats.org/officeDocument/2006/customXml" ds:itemID="{E14976A9-7010-4417-A098-9E5B9DFFB115}">
+  <ds:schemaRefs>
+    <ds:schemaRef ds:uri="http://schemas.openxmlformats.org/officeDocument/2006/bibliography"/>
+  </ds:schemaRefs>
+</ds:datastoreItem>
 </file>
 
-<file path=customXml/item3.xml><?xml version="1.0" encoding="utf-8"?>
-<p:properties xmlns:p="http://schemas.microsoft.com/office/2006/metadata/properties" xmlns:xsi="http://www.w3.org/2001/XMLSchema-instance" xmlns:pc="http://schemas.microsoft.com/office/infopath/2007/PartnerControls">
-  <documentManagement>
-    <_activity xmlns="68107622-43a1-49c8-a214-d129ef5e3b8c" xsi:nil="true"/>
-  </documentManagement>
-</p:properties>
+<file path=customXml/itemProps2.xml><?xml version="1.0" encoding="utf-8"?>
+<ds:datastoreItem xmlns:ds="http://schemas.openxmlformats.org/officeDocument/2006/customXml" ds:itemID="{3836715A-C434-409A-98F3-F2E6E0EC68C1}">
+  <ds:schemaRefs>
+    <ds:schemaRef ds:uri="http://schemas.microsoft.com/office/2006/metadata/properties"/>
+    <ds:schemaRef ds:uri="http://schemas.microsoft.com/office/infopath/2007/PartnerControls"/>
+    <ds:schemaRef ds:uri="68107622-43a1-49c8-a214-d129ef5e3b8c"/>
+  </ds:schemaRefs>
+</ds:datastoreItem>
 </file>
 
-<file path=customXml/item4.xml><?xml version="1.0" encoding="utf-8"?>
-<b:Sources xmlns:b="http://schemas.openxmlformats.org/officeDocument/2006/bibliography" xmlns="http://schemas.openxmlformats.org/officeDocument/2006/bibliography" SelectedStyle="\APASixthEditionOfficeOnline.xsl" StyleName="APA" Version="6"/>
+<file path=customXml/itemProps3.xml><?xml version="1.0" encoding="utf-8"?>
+<ds:datastoreItem xmlns:ds="http://schemas.openxmlformats.org/officeDocument/2006/customXml" ds:itemID="{9A720D37-160F-4A3E-A9E9-3DB9D3A341AC}">
+  <ds:schemaRefs>
+    <ds:schemaRef ds:uri="http://schemas.microsoft.com/sharepoint/v3/contenttype/forms"/>
+  </ds:schemaRefs>
+</ds:datastoreItem>
 </file>
 
-<file path=customXml/itemProps1.xml><?xml version="1.0" encoding="utf-8"?>
+<file path=customXml/itemProps4.xml><?xml version="1.0" encoding="utf-8"?>
 <ds:datastoreItem xmlns:ds="http://schemas.openxmlformats.org/officeDocument/2006/customXml" ds:itemID="{6E4A4378-B1F7-481E-991E-874563831C52}">
   <ds:schemaRefs>
     <ds:schemaRef ds:uri="http://schemas.microsoft.com/office/2006/metadata/contentType"/>
@@ -2737,30 +2802,4 @@
     <ds:schemaRef ds:uri="http://schemas.microsoft.com/internal/obd"/>
   </ds:schemaRefs>
 </ds:datastoreItem>
-</file>
-
-<file path=customXml/itemProps2.xml><?xml version="1.0" encoding="utf-8"?>
-<ds:datastoreItem xmlns:ds="http://schemas.openxmlformats.org/officeDocument/2006/customXml" ds:itemID="{9A720D37-160F-4A3E-A9E9-3DB9D3A341AC}">
-  <ds:schemaRefs>
-    <ds:schemaRef ds:uri="http://schemas.microsoft.com/sharepoint/v3/contenttype/forms"/>
-  </ds:schemaRefs>
-</ds:datastoreItem>
-</file>
-
-<file path=customXml/itemProps3.xml><?xml version="1.0" encoding="utf-8"?>
-<ds:datastoreItem xmlns:ds="http://schemas.openxmlformats.org/officeDocument/2006/customXml" ds:itemID="{3836715A-C434-409A-98F3-F2E6E0EC68C1}">
-  <ds:schemaRefs>
-    <ds:schemaRef ds:uri="http://schemas.microsoft.com/office/2006/metadata/properties"/>
-    <ds:schemaRef ds:uri="http://schemas.microsoft.com/office/infopath/2007/PartnerControls"/>
-    <ds:schemaRef ds:uri="68107622-43a1-49c8-a214-d129ef5e3b8c"/>
-  </ds:schemaRefs>
-</ds:datastoreItem>
-</file>
-
-<file path=customXml/itemProps4.xml><?xml version="1.0" encoding="utf-8"?>
-<ds:datastoreItem xmlns:ds="http://schemas.openxmlformats.org/officeDocument/2006/customXml" ds:itemID="{E14976A9-7010-4417-A098-9E5B9DFFB115}">
-  <ds:schemaRefs>
-    <ds:schemaRef ds:uri="http://schemas.openxmlformats.org/officeDocument/2006/bibliography"/>
-  </ds:schemaRefs>
-</ds:datastoreItem>
 </file>
</xml_diff>

<commit_message>
Deleted password requirement and made it so customer id is now for email only
</commit_message>
<xml_diff>
--- a/docs/Milestone 2(3) System Design/MIS3371-Data-Dictionary.docx
+++ b/docs/Milestone 2(3) System Design/MIS3371-Data-Dictionary.docx
@@ -193,11 +193,9 @@
             <w:pPr>
               <w:spacing w:after="160" w:line="278" w:lineRule="auto"/>
             </w:pPr>
-            <w:proofErr w:type="spellStart"/>
             <w:r>
               <w:t>claimID</w:t>
             </w:r>
-            <w:proofErr w:type="spellEnd"/>
           </w:p>
         </w:tc>
         <w:tc>
@@ -298,11 +296,9 @@
             <w:pPr>
               <w:spacing w:after="160" w:line="278" w:lineRule="auto"/>
             </w:pPr>
-            <w:proofErr w:type="spellStart"/>
             <w:r>
               <w:t>customerID</w:t>
             </w:r>
-            <w:proofErr w:type="spellEnd"/>
           </w:p>
         </w:tc>
         <w:tc>
@@ -315,7 +311,10 @@
               <w:spacing w:after="160" w:line="278" w:lineRule="auto"/>
             </w:pPr>
             <w:r>
-              <w:t>Loyalty account ID of the customer claiming</w:t>
+              <w:t>Email</w:t>
+            </w:r>
+            <w:r>
+              <w:t xml:space="preserve"> of the customer claiming</w:t>
             </w:r>
           </w:p>
         </w:tc>
@@ -329,7 +328,7 @@
               <w:spacing w:after="160" w:line="278" w:lineRule="auto"/>
             </w:pPr>
             <w:r>
-              <w:t>string</w:t>
+              <w:t>email</w:t>
             </w:r>
           </w:p>
         </w:tc>
@@ -385,7 +384,7 @@
               <w:spacing w:after="160" w:line="278" w:lineRule="auto"/>
             </w:pPr>
             <w:r>
-              <w:t>CUST-10234</w:t>
+              <w:t>Example.gmail.com</w:t>
             </w:r>
           </w:p>
         </w:tc>
@@ -403,11 +402,9 @@
             <w:pPr>
               <w:spacing w:after="160" w:line="278" w:lineRule="auto"/>
             </w:pPr>
-            <w:proofErr w:type="spellStart"/>
             <w:r>
               <w:t>claimDate</w:t>
             </w:r>
-            <w:proofErr w:type="spellEnd"/>
           </w:p>
         </w:tc>
         <w:tc>
@@ -614,11 +611,9 @@
             <w:pPr>
               <w:spacing w:after="160" w:line="278" w:lineRule="auto"/>
             </w:pPr>
-            <w:proofErr w:type="spellStart"/>
             <w:r>
               <w:t>itemPrice</w:t>
             </w:r>
-            <w:proofErr w:type="spellEnd"/>
           </w:p>
         </w:tc>
         <w:tc>
@@ -828,11 +823,9 @@
             <w:pPr>
               <w:spacing w:after="160" w:line="278" w:lineRule="auto"/>
             </w:pPr>
-            <w:proofErr w:type="spellStart"/>
             <w:r>
               <w:t>receiptAttached</w:t>
             </w:r>
-            <w:proofErr w:type="spellEnd"/>
           </w:p>
         </w:tc>
         <w:tc>
@@ -858,11 +851,9 @@
             <w:pPr>
               <w:spacing w:after="160" w:line="278" w:lineRule="auto"/>
             </w:pPr>
-            <w:proofErr w:type="spellStart"/>
             <w:r>
               <w:t>boolean</w:t>
             </w:r>
-            <w:proofErr w:type="spellEnd"/>
           </w:p>
         </w:tc>
         <w:tc>
@@ -875,7 +866,7 @@
               <w:spacing w:after="160" w:line="278" w:lineRule="auto"/>
             </w:pPr>
             <w:r>
-              <w:t>Conditional</w:t>
+              <w:t>Optional</w:t>
             </w:r>
           </w:p>
         </w:tc>
@@ -935,12 +926,10 @@
             <w:pPr>
               <w:spacing w:after="160" w:line="278" w:lineRule="auto"/>
             </w:pPr>
-            <w:proofErr w:type="spellStart"/>
             <w:r>
               <w:lastRenderedPageBreak/>
               <w:t>pointsRequired</w:t>
             </w:r>
-            <w:proofErr w:type="spellEnd"/>
           </w:p>
         </w:tc>
         <w:tc>
@@ -1012,13 +1001,8 @@
               <w:spacing w:after="160" w:line="278" w:lineRule="auto"/>
             </w:pPr>
             <w:r>
-              <w:t xml:space="preserve">Calculated from </w:t>
-            </w:r>
-            <w:proofErr w:type="spellStart"/>
-            <w:r>
-              <w:t>itemPrice</w:t>
-            </w:r>
-            <w:proofErr w:type="spellEnd"/>
+              <w:t>Calculated from itemPrice</w:t>
+            </w:r>
           </w:p>
         </w:tc>
         <w:tc>
@@ -1047,11 +1031,9 @@
             <w:vAlign w:val="center"/>
           </w:tcPr>
           <w:p>
-            <w:proofErr w:type="spellStart"/>
             <w:r>
               <w:t>availablePoints</w:t>
             </w:r>
-            <w:proofErr w:type="spellEnd"/>
           </w:p>
         </w:tc>
         <w:tc>
@@ -1061,15 +1043,7 @@
           </w:tcPr>
           <w:p>
             <w:r>
-              <w:t xml:space="preserve">Points the customer currently </w:t>
-            </w:r>
-            <w:proofErr w:type="gramStart"/>
-            <w:r>
-              <w:t>has to</w:t>
-            </w:r>
-            <w:proofErr w:type="gramEnd"/>
-            <w:r>
-              <w:t xml:space="preserve"> spend</w:t>
+              <w:t>Points the customer currently has to spend</w:t>
             </w:r>
           </w:p>
         </w:tc>
@@ -1113,13 +1087,8 @@
           </w:tcPr>
           <w:p>
             <w:r>
-              <w:t xml:space="preserve">Pulled from the customer’s loyalty account using </w:t>
-            </w:r>
-            <w:proofErr w:type="spellStart"/>
-            <w:r>
-              <w:t>customerID</w:t>
-            </w:r>
-            <w:proofErr w:type="spellEnd"/>
+              <w:t>Pulled from the customer’s loyalty account using customerID</w:t>
+            </w:r>
           </w:p>
         </w:tc>
         <w:tc>
@@ -1176,13 +1145,8 @@
               <w:spacing w:after="160" w:line="278" w:lineRule="auto"/>
             </w:pPr>
             <w:r>
-              <w:t>String/</w:t>
-            </w:r>
-            <w:proofErr w:type="spellStart"/>
-            <w:r>
-              <w:t>enum</w:t>
-            </w:r>
-            <w:proofErr w:type="spellEnd"/>
+              <w:t>String/enum</w:t>
+            </w:r>
           </w:p>
         </w:tc>
         <w:tc>
@@ -2584,27 +2548,6 @@
 </file>
 
 <file path=customXml/item1.xml><?xml version="1.0" encoding="utf-8"?>
-<b:Sources xmlns:b="http://schemas.openxmlformats.org/officeDocument/2006/bibliography" xmlns="http://schemas.openxmlformats.org/officeDocument/2006/bibliography" SelectedStyle="\APASixthEditionOfficeOnline.xsl" StyleName="APA" Version="6"/>
-</file>
-
-<file path=customXml/item2.xml><?xml version="1.0" encoding="utf-8"?>
-<p:properties xmlns:p="http://schemas.microsoft.com/office/2006/metadata/properties" xmlns:xsi="http://www.w3.org/2001/XMLSchema-instance" xmlns:pc="http://schemas.microsoft.com/office/infopath/2007/PartnerControls">
-  <documentManagement>
-    <_activity xmlns="68107622-43a1-49c8-a214-d129ef5e3b8c" xsi:nil="true"/>
-  </documentManagement>
-</p:properties>
-</file>
-
-<file path=customXml/item3.xml><?xml version="1.0" encoding="utf-8"?>
-<?mso-contentType ?>
-<FormTemplates xmlns="http://schemas.microsoft.com/sharepoint/v3/contenttype/forms">
-  <Display>DocumentLibraryForm</Display>
-  <Edit>DocumentLibraryForm</Edit>
-  <New>DocumentLibraryForm</New>
-</FormTemplates>
-</file>
-
-<file path=customXml/item4.xml><?xml version="1.0" encoding="utf-8"?>
 <ct:contentTypeSchema xmlns:ct="http://schemas.microsoft.com/office/2006/metadata/contentType" xmlns:ma="http://schemas.microsoft.com/office/2006/metadata/properties/metaAttributes" ct:_="" ma:_="" ma:contentTypeName="Document" ma:contentTypeID="0x010100112A4F20A68A3245B38AC9ED5E9EDED5" ma:contentTypeVersion="6" ma:contentTypeDescription="Create a new document." ma:contentTypeScope="" ma:versionID="bd3f642476fc6b4e2c845a5635fc7edb">
   <xsd:schema xmlns:xsd="http://www.w3.org/2001/XMLSchema" xmlns:xs="http://www.w3.org/2001/XMLSchema" xmlns:p="http://schemas.microsoft.com/office/2006/metadata/properties" xmlns:ns3="68107622-43a1-49c8-a214-d129ef5e3b8c" targetNamespace="http://schemas.microsoft.com/office/2006/metadata/properties" ma:root="true" ma:fieldsID="54157aad579c88213110e0868dfe51dd" ns3:_="">
     <xsd:import namespace="68107622-43a1-49c8-a214-d129ef5e3b8c"/>
@@ -2760,33 +2703,28 @@
 </ct:contentTypeSchema>
 </file>
 
-<file path=customXml/itemProps1.xml><?xml version="1.0" encoding="utf-8"?>
-<ds:datastoreItem xmlns:ds="http://schemas.openxmlformats.org/officeDocument/2006/customXml" ds:itemID="{E14976A9-7010-4417-A098-9E5B9DFFB115}">
-  <ds:schemaRefs>
-    <ds:schemaRef ds:uri="http://schemas.openxmlformats.org/officeDocument/2006/bibliography"/>
-  </ds:schemaRefs>
-</ds:datastoreItem>
+<file path=customXml/item2.xml><?xml version="1.0" encoding="utf-8"?>
+<?mso-contentType ?>
+<FormTemplates xmlns="http://schemas.microsoft.com/sharepoint/v3/contenttype/forms">
+  <Display>DocumentLibraryForm</Display>
+  <Edit>DocumentLibraryForm</Edit>
+  <New>DocumentLibraryForm</New>
+</FormTemplates>
 </file>
 
-<file path=customXml/itemProps2.xml><?xml version="1.0" encoding="utf-8"?>
-<ds:datastoreItem xmlns:ds="http://schemas.openxmlformats.org/officeDocument/2006/customXml" ds:itemID="{3836715A-C434-409A-98F3-F2E6E0EC68C1}">
-  <ds:schemaRefs>
-    <ds:schemaRef ds:uri="http://schemas.microsoft.com/office/2006/metadata/properties"/>
-    <ds:schemaRef ds:uri="http://schemas.microsoft.com/office/infopath/2007/PartnerControls"/>
-    <ds:schemaRef ds:uri="68107622-43a1-49c8-a214-d129ef5e3b8c"/>
-  </ds:schemaRefs>
-</ds:datastoreItem>
+<file path=customXml/item3.xml><?xml version="1.0" encoding="utf-8"?>
+<p:properties xmlns:p="http://schemas.microsoft.com/office/2006/metadata/properties" xmlns:xsi="http://www.w3.org/2001/XMLSchema-instance" xmlns:pc="http://schemas.microsoft.com/office/infopath/2007/PartnerControls">
+  <documentManagement>
+    <_activity xmlns="68107622-43a1-49c8-a214-d129ef5e3b8c" xsi:nil="true"/>
+  </documentManagement>
+</p:properties>
 </file>
 
-<file path=customXml/itemProps3.xml><?xml version="1.0" encoding="utf-8"?>
-<ds:datastoreItem xmlns:ds="http://schemas.openxmlformats.org/officeDocument/2006/customXml" ds:itemID="{9A720D37-160F-4A3E-A9E9-3DB9D3A341AC}">
-  <ds:schemaRefs>
-    <ds:schemaRef ds:uri="http://schemas.microsoft.com/sharepoint/v3/contenttype/forms"/>
-  </ds:schemaRefs>
-</ds:datastoreItem>
+<file path=customXml/item4.xml><?xml version="1.0" encoding="utf-8"?>
+<b:Sources xmlns:b="http://schemas.openxmlformats.org/officeDocument/2006/bibliography" xmlns="http://schemas.openxmlformats.org/officeDocument/2006/bibliography" SelectedStyle="\APASixthEditionOfficeOnline.xsl" StyleName="APA" Version="6"/>
 </file>
 
-<file path=customXml/itemProps4.xml><?xml version="1.0" encoding="utf-8"?>
+<file path=customXml/itemProps1.xml><?xml version="1.0" encoding="utf-8"?>
 <ds:datastoreItem xmlns:ds="http://schemas.openxmlformats.org/officeDocument/2006/customXml" ds:itemID="{6E4A4378-B1F7-481E-991E-874563831C52}">
   <ds:schemaRefs>
     <ds:schemaRef ds:uri="http://schemas.microsoft.com/office/2006/metadata/contentType"/>
@@ -2802,4 +2740,30 @@
     <ds:schemaRef ds:uri="http://schemas.microsoft.com/internal/obd"/>
   </ds:schemaRefs>
 </ds:datastoreItem>
+</file>
+
+<file path=customXml/itemProps2.xml><?xml version="1.0" encoding="utf-8"?>
+<ds:datastoreItem xmlns:ds="http://schemas.openxmlformats.org/officeDocument/2006/customXml" ds:itemID="{9A720D37-160F-4A3E-A9E9-3DB9D3A341AC}">
+  <ds:schemaRefs>
+    <ds:schemaRef ds:uri="http://schemas.microsoft.com/sharepoint/v3/contenttype/forms"/>
+  </ds:schemaRefs>
+</ds:datastoreItem>
+</file>
+
+<file path=customXml/itemProps3.xml><?xml version="1.0" encoding="utf-8"?>
+<ds:datastoreItem xmlns:ds="http://schemas.openxmlformats.org/officeDocument/2006/customXml" ds:itemID="{3836715A-C434-409A-98F3-F2E6E0EC68C1}">
+  <ds:schemaRefs>
+    <ds:schemaRef ds:uri="http://schemas.microsoft.com/office/2006/metadata/properties"/>
+    <ds:schemaRef ds:uri="http://schemas.microsoft.com/office/infopath/2007/PartnerControls"/>
+    <ds:schemaRef ds:uri="68107622-43a1-49c8-a214-d129ef5e3b8c"/>
+  </ds:schemaRefs>
+</ds:datastoreItem>
+</file>
+
+<file path=customXml/itemProps4.xml><?xml version="1.0" encoding="utf-8"?>
+<ds:datastoreItem xmlns:ds="http://schemas.openxmlformats.org/officeDocument/2006/customXml" ds:itemID="{E14976A9-7010-4417-A098-9E5B9DFFB115}">
+  <ds:schemaRefs>
+    <ds:schemaRef ds:uri="http://schemas.openxmlformats.org/officeDocument/2006/bibliography"/>
+  </ds:schemaRefs>
+</ds:datastoreItem>
 </file>
</xml_diff>